<commit_message>
fix(fiber): 书签映射修复 — Recommend/VertifyResult/StringValue比较
</commit_message>
<xml_diff>
--- a/wwwroot/DocxModel/FIBER_ANALYSIS_DATA_SHEET.docx
+++ b/wwwroot/DocxModel/FIBER_ANALYSIS_DATA_SHEET.docx
@@ -2038,6 +2038,175 @@
               <w:rPr>
                 <w:rFonts w:ascii="Arial" w:eastAsia="黑体" w:hAnsi="Arial" w:cs="Arial"/>
                 <w:color w:val="538135" w:themeColor="accent6" w:themeShade="BF"/>
+                <w:sz w:val="20"/>
+                <w:szCs w:val="20"/>
+              </w:rPr>
+            </w:pPr>
+          </w:p>
+        </w:tc>
+        <w:tc>
+          <w:tcPr>
+            <w:tcW w:w="1276" w:type="dxa"/>
+          </w:tcPr>
+          <w:p>
+            <w:pPr>
+              <w:spacing w:after="0" w:line="240" w:lineRule="auto"/>
+              <w:jc w:val="center"/>
+              <w:rPr>
+                <w:rFonts w:ascii="Arial" w:eastAsia="黑体" w:hAnsi="Arial" w:cs="Arial"/>
+                <w:sz w:val="18"/>
+                <w:szCs w:val="18"/>
+              </w:rPr>
+            </w:pPr>
+          </w:p>
+        </w:tc>
+        <w:tc>
+          <w:tcPr>
+            <w:tcW w:w="851" w:type="dxa"/>
+          </w:tcPr>
+          <w:p>
+            <w:pPr>
+              <w:spacing w:after="0" w:line="240" w:lineRule="auto"/>
+              <w:jc w:val="center"/>
+              <w:rPr>
+                <w:rFonts w:ascii="Arial" w:eastAsia="黑体" w:hAnsi="Arial" w:cs="Arial"/>
+                <w:sz w:val="14"/>
+                <w:szCs w:val="14"/>
+                <w:u w:val="single"/>
+              </w:rPr>
+            </w:pPr>
+          </w:p>
+        </w:tc>
+        <w:tc>
+          <w:tcPr>
+            <w:tcW w:w="1134" w:type="dxa"/>
+          </w:tcPr>
+          <w:p>
+            <w:pPr>
+              <w:spacing w:after="0" w:line="240" w:lineRule="auto"/>
+              <w:jc w:val="center"/>
+              <w:rPr>
+                <w:rFonts w:ascii="Arial" w:eastAsia="黑体" w:hAnsi="Arial" w:cs="Arial"/>
+                <w:sz w:val="14"/>
+                <w:szCs w:val="14"/>
+                <w:u w:val="single"/>
+              </w:rPr>
+            </w:pPr>
+          </w:p>
+        </w:tc>
+        <w:tc>
+          <w:tcPr>
+            <w:tcW w:w="850" w:type="dxa"/>
+          </w:tcPr>
+          <w:p>
+            <w:pPr>
+              <w:spacing w:after="0" w:line="240" w:lineRule="auto"/>
+              <w:jc w:val="center"/>
+              <w:rPr>
+                <w:rFonts w:ascii="Arial" w:eastAsia="黑体" w:hAnsi="Arial" w:cs="Arial"/>
+                <w:sz w:val="14"/>
+                <w:szCs w:val="14"/>
+                <w:u w:val="single"/>
+              </w:rPr>
+            </w:pPr>
+          </w:p>
+        </w:tc>
+        <w:tc>
+          <w:tcPr>
+            <w:tcW w:w="1134" w:type="dxa"/>
+          </w:tcPr>
+          <w:p>
+            <w:pPr>
+              <w:spacing w:after="0" w:line="240" w:lineRule="auto"/>
+              <w:jc w:val="center"/>
+              <w:rPr>
+                <w:rFonts w:ascii="Arial" w:eastAsia="黑体" w:hAnsi="Arial" w:cs="Arial"/>
+                <w:sz w:val="14"/>
+                <w:szCs w:val="14"/>
+                <w:u w:val="single"/>
+              </w:rPr>
+            </w:pPr>
+          </w:p>
+        </w:tc>
+        <w:tc>
+          <w:tcPr>
+            <w:tcW w:w="1134" w:type="dxa"/>
+          </w:tcPr>
+          <w:p>
+            <w:pPr>
+              <w:spacing w:after="0" w:line="240" w:lineRule="auto"/>
+              <w:jc w:val="center"/>
+              <w:rPr>
+                <w:sz w:val="14"/>
+                <w:szCs w:val="14"/>
+                <w:u w:val="single"/>
+              </w:rPr>
+            </w:pPr>
+          </w:p>
+        </w:tc>
+        <w:tc>
+          <w:tcPr>
+            <w:tcW w:w="851" w:type="dxa"/>
+          </w:tcPr>
+          <w:p>
+            <w:pPr>
+              <w:spacing w:after="0" w:line="240" w:lineRule="auto"/>
+              <w:jc w:val="center"/>
+              <w:rPr>
+                <w:sz w:val="14"/>
+                <w:szCs w:val="14"/>
+                <w:u w:val="single"/>
+              </w:rPr>
+            </w:pPr>
+          </w:p>
+        </w:tc>
+        <w:tc>
+          <w:tcPr>
+            <w:tcW w:w="1134" w:type="dxa"/>
+          </w:tcPr>
+          <w:p>
+            <w:pPr>
+              <w:spacing w:after="0" w:line="240" w:lineRule="auto"/>
+              <w:jc w:val="center"/>
+              <w:rPr>
+                <w:sz w:val="14"/>
+                <w:szCs w:val="14"/>
+                <w:u w:val="single"/>
+              </w:rPr>
+            </w:pPr>
+          </w:p>
+        </w:tc>
+        <w:tc>
+          <w:tcPr>
+            <w:tcW w:w="992" w:type="dxa"/>
+          </w:tcPr>
+          <w:p>
+            <w:pPr>
+              <w:spacing w:after="0" w:line="240" w:lineRule="auto"/>
+              <w:jc w:val="center"/>
+              <w:rPr>
+                <w:sz w:val="14"/>
+                <w:szCs w:val="14"/>
+                <w:u w:val="single"/>
+              </w:rPr>
+            </w:pPr>
+          </w:p>
+        </w:tc>
+      </w:tr>
+      <w:tr>
+        <w:trPr>
+          <w:trHeight w:val="191"/>
+        </w:trPr>
+        <w:tc>
+          <w:tcPr>
+            <w:tcW w:w="1134" w:type="dxa"/>
+          </w:tcPr>
+          <w:p>
+            <w:pPr>
+              <w:spacing w:after="0" w:line="240" w:lineRule="auto"/>
+              <w:rPr>
+                <w:rFonts w:ascii="Arial" w:eastAsia="黑体" w:hAnsi="Arial" w:cs="Arial"/>
+                <w:color w:val="538135" w:themeColor="accent6" w:themeShade="BF"/>
                 <w:sz w:val="18"/>
                 <w:szCs w:val="18"/>
               </w:rPr>
@@ -3883,8 +4052,8 @@
         <w:gridCol w:w="3261"/>
         <w:gridCol w:w="1700"/>
         <w:gridCol w:w="2127"/>
-        <w:gridCol w:w="2410"/>
-        <w:gridCol w:w="992"/>
+        <w:gridCol w:w="2126"/>
+        <w:gridCol w:w="1276"/>
       </w:tblGrid>
       <w:tr>
         <w:trPr>
@@ -3965,7 +4134,7 @@
         </w:tc>
         <w:tc>
           <w:tcPr>
-            <w:tcW w:w="2410" w:type="dxa"/>
+            <w:tcW w:w="2126" w:type="dxa"/>
           </w:tcPr>
           <w:p>
             <w:pPr>
@@ -3984,7 +4153,7 @@
         </w:tc>
         <w:tc>
           <w:tcPr>
-            <w:tcW w:w="992" w:type="dxa"/>
+            <w:tcW w:w="1276" w:type="dxa"/>
           </w:tcPr>
           <w:p>
             <w:pPr>
@@ -3993,16 +4162,16 @@
               <w:rPr>
                 <w:rFonts w:ascii="Arial" w:hAnsi="Arial" w:cs="Arial"/>
                 <w:bCs/>
-                <w:sz w:val="14"/>
-                <w:szCs w:val="14"/>
+                <w:sz w:val="20"/>
+                <w:szCs w:val="20"/>
               </w:rPr>
             </w:pPr>
             <w:r>
               <w:rPr>
                 <w:rFonts w:ascii="Arial" w:hAnsi="Arial" w:cs="Arial" w:hint="eastAsia"/>
                 <w:bCs/>
-                <w:sz w:val="14"/>
-                <w:szCs w:val="14"/>
+                <w:sz w:val="20"/>
+                <w:szCs w:val="20"/>
               </w:rPr>
               <w:t>Conclusion</w:t>
             </w:r>
@@ -4093,7 +4262,7 @@
         </w:tc>
         <w:tc>
           <w:tcPr>
-            <w:tcW w:w="2410" w:type="dxa"/>
+            <w:tcW w:w="2126" w:type="dxa"/>
           </w:tcPr>
           <w:p>
             <w:pPr>
@@ -4111,13 +4280,13 @@
         </w:tc>
         <w:tc>
           <w:tcPr>
-            <w:tcW w:w="992" w:type="dxa"/>
+            <w:tcW w:w="1276" w:type="dxa"/>
             <w:vMerge w:val="restart"/>
           </w:tcPr>
           <w:p>
             <w:pPr>
               <w:pStyle w:val="aa"/>
-              <w:ind w:right="400"/>
+              <w:ind w:right="1000"/>
               <w:jc w:val="right"/>
               <w:rPr>
                 <w:rFonts w:ascii="Arial" w:hAnsi="Arial" w:cs="Arial"/>
@@ -4127,7 +4296,9 @@
               </w:rPr>
             </w:pPr>
             <w:bookmarkStart w:id="120" w:name="FinalRemark"/>
+            <w:bookmarkStart w:id="121" w:name="VertifyResult"/>
             <w:bookmarkEnd w:id="120"/>
+            <w:bookmarkEnd w:id="121"/>
           </w:p>
         </w:tc>
       </w:tr>
@@ -4161,8 +4332,8 @@
                 <w:noProof/>
               </w:rPr>
             </w:pPr>
-            <w:bookmarkStart w:id="121" w:name="TestResult_3"/>
-            <w:bookmarkEnd w:id="121"/>
+            <w:bookmarkStart w:id="122" w:name="TestResult_3"/>
+            <w:bookmarkEnd w:id="122"/>
           </w:p>
         </w:tc>
         <w:tc>
@@ -4180,7 +4351,7 @@
         </w:tc>
         <w:tc>
           <w:tcPr>
-            <w:tcW w:w="2410" w:type="dxa"/>
+            <w:tcW w:w="2126" w:type="dxa"/>
           </w:tcPr>
           <w:p>
             <w:pPr>
@@ -4189,13 +4360,13 @@
                 <w:noProof/>
               </w:rPr>
             </w:pPr>
-            <w:bookmarkStart w:id="122" w:name="Recommendation_3"/>
-            <w:bookmarkEnd w:id="122"/>
-          </w:p>
-        </w:tc>
-        <w:tc>
-          <w:tcPr>
-            <w:tcW w:w="992" w:type="dxa"/>
+            <w:bookmarkStart w:id="123" w:name="Recommendation_3"/>
+            <w:bookmarkEnd w:id="123"/>
+          </w:p>
+        </w:tc>
+        <w:tc>
+          <w:tcPr>
+            <w:tcW w:w="1276" w:type="dxa"/>
             <w:vMerge/>
           </w:tcPr>
           <w:p>
@@ -4238,8 +4409,8 @@
                 <w:noProof/>
               </w:rPr>
             </w:pPr>
-            <w:bookmarkStart w:id="123" w:name="TestResult_4"/>
-            <w:bookmarkEnd w:id="123"/>
+            <w:bookmarkStart w:id="124" w:name="TestResult_4"/>
+            <w:bookmarkEnd w:id="124"/>
           </w:p>
         </w:tc>
         <w:tc>
@@ -4257,7 +4428,7 @@
         </w:tc>
         <w:tc>
           <w:tcPr>
-            <w:tcW w:w="2410" w:type="dxa"/>
+            <w:tcW w:w="2126" w:type="dxa"/>
           </w:tcPr>
           <w:p>
             <w:pPr>
@@ -4266,13 +4437,13 @@
                 <w:noProof/>
               </w:rPr>
             </w:pPr>
-            <w:bookmarkStart w:id="124" w:name="Recommendation_4"/>
-            <w:bookmarkEnd w:id="124"/>
-          </w:p>
-        </w:tc>
-        <w:tc>
-          <w:tcPr>
-            <w:tcW w:w="992" w:type="dxa"/>
+            <w:bookmarkStart w:id="125" w:name="Recommendation_4"/>
+            <w:bookmarkEnd w:id="125"/>
+          </w:p>
+        </w:tc>
+        <w:tc>
+          <w:tcPr>
+            <w:tcW w:w="1276" w:type="dxa"/>
             <w:vMerge/>
           </w:tcPr>
           <w:p>
@@ -4315,8 +4486,8 @@
                 <w:noProof/>
               </w:rPr>
             </w:pPr>
-            <w:bookmarkStart w:id="125" w:name="TestResult_5"/>
-            <w:bookmarkEnd w:id="125"/>
+            <w:bookmarkStart w:id="126" w:name="TestResult_5"/>
+            <w:bookmarkEnd w:id="126"/>
           </w:p>
         </w:tc>
         <w:tc>
@@ -4334,7 +4505,7 @@
         </w:tc>
         <w:tc>
           <w:tcPr>
-            <w:tcW w:w="2410" w:type="dxa"/>
+            <w:tcW w:w="2126" w:type="dxa"/>
           </w:tcPr>
           <w:p>
             <w:pPr>
@@ -4343,29 +4514,29 @@
                 <w:noProof/>
               </w:rPr>
             </w:pPr>
-            <w:bookmarkStart w:id="126" w:name="Recommendation_5"/>
-            <w:bookmarkEnd w:id="126"/>
-          </w:p>
-        </w:tc>
-        <w:tc>
-          <w:tcPr>
-            <w:tcW w:w="992" w:type="dxa"/>
+            <w:bookmarkStart w:id="127" w:name="Recommendation_5"/>
+            <w:bookmarkEnd w:id="127"/>
+          </w:p>
+        </w:tc>
+        <w:tc>
+          <w:tcPr>
+            <w:tcW w:w="1276" w:type="dxa"/>
           </w:tcPr>
           <w:p>
             <w:pPr>
               <w:pStyle w:val="aa"/>
               <w:rPr>
                 <w:noProof/>
-                <w:sz w:val="16"/>
-                <w:szCs w:val="16"/>
+                <w:sz w:val="24"/>
+                <w:szCs w:val="24"/>
               </w:rPr>
             </w:pPr>
             <w:r>
               <w:rPr>
                 <w:rFonts w:hint="eastAsia"/>
                 <w:noProof/>
-                <w:sz w:val="16"/>
-                <w:szCs w:val="16"/>
+                <w:sz w:val="24"/>
+                <w:szCs w:val="24"/>
               </w:rPr>
               <w:t>耐久标：</w:t>
             </w:r>
@@ -4402,8 +4573,8 @@
                 <w:noProof/>
               </w:rPr>
             </w:pPr>
-            <w:bookmarkStart w:id="127" w:name="TestResult_6"/>
-            <w:bookmarkEnd w:id="127"/>
+            <w:bookmarkStart w:id="128" w:name="TestResult_6"/>
+            <w:bookmarkEnd w:id="128"/>
           </w:p>
         </w:tc>
         <w:tc>
@@ -4421,7 +4592,7 @@
         </w:tc>
         <w:tc>
           <w:tcPr>
-            <w:tcW w:w="2410" w:type="dxa"/>
+            <w:tcW w:w="2126" w:type="dxa"/>
           </w:tcPr>
           <w:p>
             <w:pPr>
@@ -4430,25 +4601,25 @@
                 <w:noProof/>
               </w:rPr>
             </w:pPr>
-            <w:bookmarkStart w:id="128" w:name="Recommendation_6"/>
-            <w:bookmarkEnd w:id="128"/>
-          </w:p>
-        </w:tc>
-        <w:tc>
-          <w:tcPr>
-            <w:tcW w:w="992" w:type="dxa"/>
+            <w:bookmarkStart w:id="129" w:name="Recommendation_6"/>
+            <w:bookmarkEnd w:id="129"/>
+          </w:p>
+        </w:tc>
+        <w:tc>
+          <w:tcPr>
+            <w:tcW w:w="1276" w:type="dxa"/>
           </w:tcPr>
           <w:p>
             <w:pPr>
               <w:pStyle w:val="aa"/>
               <w:rPr>
                 <w:noProof/>
-                <w:sz w:val="16"/>
-                <w:szCs w:val="16"/>
-              </w:rPr>
-            </w:pPr>
-            <w:bookmarkStart w:id="129" w:name="DurabilityLabel"/>
-            <w:bookmarkEnd w:id="129"/>
+                <w:sz w:val="13"/>
+                <w:szCs w:val="13"/>
+              </w:rPr>
+            </w:pPr>
+            <w:bookmarkStart w:id="130" w:name="DurabilityLabel"/>
+            <w:bookmarkEnd w:id="130"/>
           </w:p>
         </w:tc>
       </w:tr>
@@ -4482,8 +4653,8 @@
                 <w:noProof/>
               </w:rPr>
             </w:pPr>
-            <w:bookmarkStart w:id="130" w:name="TestResult_7"/>
-            <w:bookmarkEnd w:id="130"/>
+            <w:bookmarkStart w:id="131" w:name="TestResult_7"/>
+            <w:bookmarkEnd w:id="131"/>
           </w:p>
         </w:tc>
         <w:tc>
@@ -4501,7 +4672,7 @@
         </w:tc>
         <w:tc>
           <w:tcPr>
-            <w:tcW w:w="2410" w:type="dxa"/>
+            <w:tcW w:w="2126" w:type="dxa"/>
           </w:tcPr>
           <w:p>
             <w:pPr>
@@ -4510,40 +4681,31 @@
                 <w:noProof/>
               </w:rPr>
             </w:pPr>
-            <w:bookmarkStart w:id="131" w:name="Recommendation_7"/>
-            <w:bookmarkEnd w:id="131"/>
-          </w:p>
-        </w:tc>
-        <w:tc>
-          <w:tcPr>
-            <w:tcW w:w="992" w:type="dxa"/>
+            <w:bookmarkStart w:id="132" w:name="Recommendation_7"/>
+            <w:bookmarkEnd w:id="132"/>
+          </w:p>
+        </w:tc>
+        <w:tc>
+          <w:tcPr>
+            <w:tcW w:w="1276" w:type="dxa"/>
           </w:tcPr>
           <w:p>
             <w:pPr>
               <w:pStyle w:val="aa"/>
               <w:rPr>
                 <w:noProof/>
-                <w:sz w:val="16"/>
-                <w:szCs w:val="16"/>
+                <w:sz w:val="24"/>
+                <w:szCs w:val="24"/>
               </w:rPr>
             </w:pPr>
             <w:r>
               <w:rPr>
                 <w:rFonts w:hint="eastAsia"/>
                 <w:noProof/>
-                <w:sz w:val="16"/>
-                <w:szCs w:val="16"/>
-              </w:rPr>
-              <w:t>其他标</w:t>
-            </w:r>
-            <w:r>
-              <w:rPr>
-                <w:rFonts w:hint="eastAsia"/>
-                <w:noProof/>
-                <w:sz w:val="16"/>
-                <w:szCs w:val="16"/>
-              </w:rPr>
-              <w:t>：</w:t>
+                <w:sz w:val="24"/>
+                <w:szCs w:val="24"/>
+              </w:rPr>
+              <w:t>其他标：</w:t>
             </w:r>
           </w:p>
         </w:tc>
@@ -4578,8 +4740,8 @@
                 <w:noProof/>
               </w:rPr>
             </w:pPr>
-            <w:bookmarkStart w:id="132" w:name="TestResult_8"/>
-            <w:bookmarkEnd w:id="132"/>
+            <w:bookmarkStart w:id="133" w:name="TestResult_8"/>
+            <w:bookmarkEnd w:id="133"/>
           </w:p>
         </w:tc>
         <w:tc>
@@ -4597,7 +4759,7 @@
         </w:tc>
         <w:tc>
           <w:tcPr>
-            <w:tcW w:w="2410" w:type="dxa"/>
+            <w:tcW w:w="2126" w:type="dxa"/>
           </w:tcPr>
           <w:p>
             <w:pPr>
@@ -4606,25 +4768,25 @@
                 <w:noProof/>
               </w:rPr>
             </w:pPr>
-            <w:bookmarkStart w:id="133" w:name="Recommendation_8"/>
-            <w:bookmarkEnd w:id="133"/>
-          </w:p>
-        </w:tc>
-        <w:tc>
-          <w:tcPr>
-            <w:tcW w:w="992" w:type="dxa"/>
+            <w:bookmarkStart w:id="134" w:name="Recommendation_8"/>
+            <w:bookmarkEnd w:id="134"/>
+          </w:p>
+        </w:tc>
+        <w:tc>
+          <w:tcPr>
+            <w:tcW w:w="1276" w:type="dxa"/>
           </w:tcPr>
           <w:p>
             <w:pPr>
               <w:pStyle w:val="aa"/>
               <w:rPr>
                 <w:noProof/>
-                <w:sz w:val="16"/>
-                <w:szCs w:val="16"/>
-              </w:rPr>
-            </w:pPr>
-            <w:bookmarkStart w:id="134" w:name="OtherLabel"/>
-            <w:bookmarkEnd w:id="134"/>
+                <w:sz w:val="13"/>
+                <w:szCs w:val="13"/>
+              </w:rPr>
+            </w:pPr>
+            <w:bookmarkStart w:id="135" w:name="OtherLabel"/>
+            <w:bookmarkEnd w:id="135"/>
           </w:p>
         </w:tc>
       </w:tr>
@@ -4658,8 +4820,8 @@
                 <w:noProof/>
               </w:rPr>
             </w:pPr>
-            <w:bookmarkStart w:id="135" w:name="TestResult_9"/>
-            <w:bookmarkEnd w:id="135"/>
+            <w:bookmarkStart w:id="136" w:name="TestResult_9"/>
+            <w:bookmarkEnd w:id="136"/>
           </w:p>
         </w:tc>
         <w:tc>
@@ -4677,7 +4839,7 @@
         </w:tc>
         <w:tc>
           <w:tcPr>
-            <w:tcW w:w="2410" w:type="dxa"/>
+            <w:tcW w:w="2126" w:type="dxa"/>
           </w:tcPr>
           <w:p>
             <w:pPr>
@@ -4686,27 +4848,29 @@
                 <w:noProof/>
               </w:rPr>
             </w:pPr>
-            <w:bookmarkStart w:id="136" w:name="Recommendation_9"/>
-            <w:bookmarkEnd w:id="136"/>
-          </w:p>
-        </w:tc>
-        <w:tc>
-          <w:tcPr>
-            <w:tcW w:w="992" w:type="dxa"/>
+            <w:bookmarkStart w:id="137" w:name="Recommendation_9"/>
+            <w:bookmarkEnd w:id="137"/>
+          </w:p>
+        </w:tc>
+        <w:tc>
+          <w:tcPr>
+            <w:tcW w:w="1276" w:type="dxa"/>
           </w:tcPr>
           <w:p>
             <w:pPr>
               <w:pStyle w:val="aa"/>
               <w:rPr>
                 <w:noProof/>
+                <w:sz w:val="24"/>
+                <w:szCs w:val="24"/>
               </w:rPr>
             </w:pPr>
             <w:r>
               <w:rPr>
                 <w:rFonts w:hint="eastAsia"/>
                 <w:noProof/>
-                <w:sz w:val="16"/>
-                <w:szCs w:val="16"/>
+                <w:sz w:val="24"/>
+                <w:szCs w:val="24"/>
               </w:rPr>
               <w:t>页面：</w:t>
             </w:r>
@@ -4743,8 +4907,8 @@
                 <w:noProof/>
               </w:rPr>
             </w:pPr>
-            <w:bookmarkStart w:id="137" w:name="TestResult_10"/>
-            <w:bookmarkEnd w:id="137"/>
+            <w:bookmarkStart w:id="138" w:name="TestResult_10"/>
+            <w:bookmarkEnd w:id="138"/>
           </w:p>
         </w:tc>
         <w:tc>
@@ -4762,7 +4926,7 @@
         </w:tc>
         <w:tc>
           <w:tcPr>
-            <w:tcW w:w="2410" w:type="dxa"/>
+            <w:tcW w:w="2126" w:type="dxa"/>
           </w:tcPr>
           <w:p>
             <w:pPr>
@@ -4771,23 +4935,25 @@
                 <w:noProof/>
               </w:rPr>
             </w:pPr>
-            <w:bookmarkStart w:id="138" w:name="Recommendation_10"/>
-            <w:bookmarkEnd w:id="138"/>
-          </w:p>
-        </w:tc>
-        <w:tc>
-          <w:tcPr>
-            <w:tcW w:w="992" w:type="dxa"/>
+            <w:bookmarkStart w:id="139" w:name="Recommendation_10"/>
+            <w:bookmarkEnd w:id="139"/>
+          </w:p>
+        </w:tc>
+        <w:tc>
+          <w:tcPr>
+            <w:tcW w:w="1276" w:type="dxa"/>
           </w:tcPr>
           <w:p>
             <w:pPr>
               <w:pStyle w:val="aa"/>
               <w:rPr>
                 <w:noProof/>
-                <w:sz w:val="16"/>
-                <w:szCs w:val="16"/>
-              </w:rPr>
-            </w:pPr>
+                <w:sz w:val="13"/>
+                <w:szCs w:val="13"/>
+              </w:rPr>
+            </w:pPr>
+            <w:bookmarkStart w:id="140" w:name="Comprehensive"/>
+            <w:bookmarkEnd w:id="140"/>
           </w:p>
         </w:tc>
       </w:tr>
@@ -4821,8 +4987,8 @@
                 <w:noProof/>
               </w:rPr>
             </w:pPr>
-            <w:bookmarkStart w:id="139" w:name="TestResult_11"/>
-            <w:bookmarkEnd w:id="139"/>
+            <w:bookmarkStart w:id="141" w:name="TestResult_11"/>
+            <w:bookmarkEnd w:id="141"/>
           </w:p>
         </w:tc>
         <w:tc>
@@ -4840,7 +5006,7 @@
         </w:tc>
         <w:tc>
           <w:tcPr>
-            <w:tcW w:w="2410" w:type="dxa"/>
+            <w:tcW w:w="2126" w:type="dxa"/>
           </w:tcPr>
           <w:p>
             <w:pPr>
@@ -4849,13 +5015,13 @@
                 <w:noProof/>
               </w:rPr>
             </w:pPr>
-            <w:bookmarkStart w:id="140" w:name="Recommendation_11"/>
-            <w:bookmarkEnd w:id="140"/>
-          </w:p>
-        </w:tc>
-        <w:tc>
-          <w:tcPr>
-            <w:tcW w:w="992" w:type="dxa"/>
+            <w:bookmarkStart w:id="142" w:name="Recommendation_11"/>
+            <w:bookmarkEnd w:id="142"/>
+          </w:p>
+        </w:tc>
+        <w:tc>
+          <w:tcPr>
+            <w:tcW w:w="1276" w:type="dxa"/>
           </w:tcPr>
           <w:p>
             <w:pPr>
@@ -4864,8 +5030,8 @@
                 <w:b/>
                 <w:bCs/>
                 <w:noProof/>
-                <w:sz w:val="16"/>
-                <w:szCs w:val="16"/>
+                <w:sz w:val="24"/>
+                <w:szCs w:val="24"/>
               </w:rPr>
             </w:pPr>
             <w:r>
@@ -4874,8 +5040,8 @@
                 <w:b/>
                 <w:bCs/>
                 <w:noProof/>
-                <w:sz w:val="16"/>
-                <w:szCs w:val="16"/>
+                <w:sz w:val="24"/>
+                <w:szCs w:val="24"/>
               </w:rPr>
               <w:t>综合：</w:t>
             </w:r>
@@ -4912,8 +5078,8 @@
                 <w:noProof/>
               </w:rPr>
             </w:pPr>
-            <w:bookmarkStart w:id="141" w:name="TestResult_12"/>
-            <w:bookmarkEnd w:id="141"/>
+            <w:bookmarkStart w:id="143" w:name="TestResult_12"/>
+            <w:bookmarkEnd w:id="143"/>
           </w:p>
         </w:tc>
         <w:tc>
@@ -4931,7 +5097,7 @@
         </w:tc>
         <w:tc>
           <w:tcPr>
-            <w:tcW w:w="2410" w:type="dxa"/>
+            <w:tcW w:w="2126" w:type="dxa"/>
           </w:tcPr>
           <w:p>
             <w:pPr>
@@ -4940,25 +5106,25 @@
                 <w:noProof/>
               </w:rPr>
             </w:pPr>
-            <w:bookmarkStart w:id="142" w:name="Recommendation_12"/>
-            <w:bookmarkEnd w:id="142"/>
-          </w:p>
-        </w:tc>
-        <w:tc>
-          <w:tcPr>
-            <w:tcW w:w="992" w:type="dxa"/>
+            <w:bookmarkStart w:id="144" w:name="Recommendation_12"/>
+            <w:bookmarkEnd w:id="144"/>
+          </w:p>
+        </w:tc>
+        <w:tc>
+          <w:tcPr>
+            <w:tcW w:w="1276" w:type="dxa"/>
           </w:tcPr>
           <w:p>
             <w:pPr>
               <w:pStyle w:val="aa"/>
               <w:rPr>
                 <w:noProof/>
-                <w:sz w:val="16"/>
-                <w:szCs w:val="16"/>
-              </w:rPr>
-            </w:pPr>
-            <w:bookmarkStart w:id="143" w:name="Comprehensive"/>
-            <w:bookmarkEnd w:id="143"/>
+                <w:sz w:val="13"/>
+                <w:szCs w:val="13"/>
+              </w:rPr>
+            </w:pPr>
+            <w:bookmarkStart w:id="145" w:name="FinalResult"/>
+            <w:bookmarkEnd w:id="145"/>
           </w:p>
         </w:tc>
       </w:tr>
@@ -5008,8 +5174,6 @@
                 <w:szCs w:val="20"/>
               </w:rPr>
             </w:pPr>
-            <w:bookmarkStart w:id="144" w:name="VerifyResult"/>
-            <w:bookmarkEnd w:id="144"/>
           </w:p>
         </w:tc>
         <w:tc>
@@ -5067,8 +5231,8 @@
                 <w:szCs w:val="20"/>
               </w:rPr>
             </w:pPr>
-            <w:bookmarkStart w:id="145" w:name="ResultRemark"/>
-            <w:bookmarkEnd w:id="145"/>
+            <w:bookmarkStart w:id="146" w:name="ResultRemark"/>
+            <w:bookmarkEnd w:id="146"/>
           </w:p>
         </w:tc>
         <w:tc>
@@ -5084,8 +5248,8 @@
                 <w:szCs w:val="20"/>
               </w:rPr>
             </w:pPr>
-            <w:bookmarkStart w:id="146" w:name="LabelRemark"/>
-            <w:bookmarkEnd w:id="146"/>
+            <w:bookmarkStart w:id="147" w:name="LabelRemark"/>
+            <w:bookmarkEnd w:id="147"/>
           </w:p>
         </w:tc>
       </w:tr>
@@ -5121,8 +5285,8 @@
                 <w:szCs w:val="20"/>
               </w:rPr>
             </w:pPr>
-            <w:bookmarkStart w:id="147" w:name="JudgmentLabelRemark"/>
-            <w:bookmarkEnd w:id="147"/>
+            <w:bookmarkStart w:id="148" w:name="JudgmentLabelRemark"/>
+            <w:bookmarkEnd w:id="148"/>
           </w:p>
         </w:tc>
       </w:tr>
@@ -5158,8 +5322,8 @@
                 <w:szCs w:val="20"/>
               </w:rPr>
             </w:pPr>
-            <w:bookmarkStart w:id="148" w:name="LanguageLabelRemark"/>
-            <w:bookmarkEnd w:id="148"/>
+            <w:bookmarkStart w:id="149" w:name="LanguageLabelRemark"/>
+            <w:bookmarkEnd w:id="149"/>
           </w:p>
         </w:tc>
       </w:tr>

</xml_diff>

<commit_message>
feat(Fiber): cellulosic细分纤维支持/AATCC other fiber/weighing bottle表/平行样标红/键盘导航/Order修复/build修复
</commit_message>
<xml_diff>
--- a/wwwroot/DocxModel/FIBER_ANALYSIS_DATA_SHEET.docx
+++ b/wwwroot/DocxModel/FIBER_ANALYSIS_DATA_SHEET.docx
@@ -4711,14 +4711,14 @@
         <w:tblLook w:val="04A0" w:firstRow="1" w:lastRow="0" w:firstColumn="1" w:lastColumn="0" w:noHBand="0" w:noVBand="1"/>
       </w:tblPr>
       <w:tblGrid>
-        <w:gridCol w:w="2694"/>
-        <w:gridCol w:w="3685"/>
-        <w:gridCol w:w="4077"/>
+        <w:gridCol w:w="1134"/>
+        <w:gridCol w:w="4536"/>
+        <w:gridCol w:w="4786"/>
       </w:tblGrid>
       <w:tr>
         <w:tc>
           <w:tcPr>
-            <w:tcW w:w="2694" w:type="dxa"/>
+            <w:tcW w:w="1134" w:type="dxa"/>
           </w:tcPr>
           <w:p>
             <w:pPr>
@@ -4743,7 +4743,7 @@
         </w:tc>
         <w:tc>
           <w:tcPr>
-            <w:tcW w:w="3685" w:type="dxa"/>
+            <w:tcW w:w="4536" w:type="dxa"/>
           </w:tcPr>
           <w:p>
             <w:pPr>
@@ -4760,7 +4760,7 @@
         </w:tc>
         <w:tc>
           <w:tcPr>
-            <w:tcW w:w="4077" w:type="dxa"/>
+            <w:tcW w:w="4786" w:type="dxa"/>
           </w:tcPr>
           <w:p>
             <w:pPr>
@@ -4779,7 +4779,7 @@
       <w:tr>
         <w:tc>
           <w:tcPr>
-            <w:tcW w:w="2694" w:type="dxa"/>
+            <w:tcW w:w="1134" w:type="dxa"/>
           </w:tcPr>
           <w:p>
             <w:pPr>
@@ -4796,7 +4796,7 @@
         </w:tc>
         <w:tc>
           <w:tcPr>
-            <w:tcW w:w="7762" w:type="dxa"/>
+            <w:tcW w:w="9322" w:type="dxa"/>
             <w:gridSpan w:val="2"/>
           </w:tcPr>
           <w:p>
@@ -4816,7 +4816,7 @@
       <w:tr>
         <w:tc>
           <w:tcPr>
-            <w:tcW w:w="2694" w:type="dxa"/>
+            <w:tcW w:w="1134" w:type="dxa"/>
           </w:tcPr>
           <w:p>
             <w:pPr>
@@ -4833,7 +4833,7 @@
         </w:tc>
         <w:tc>
           <w:tcPr>
-            <w:tcW w:w="7762" w:type="dxa"/>
+            <w:tcW w:w="9322" w:type="dxa"/>
             <w:gridSpan w:val="2"/>
           </w:tcPr>
           <w:p>

</xml_diff>